<commit_message>
input.csv output.csv dg.cpp method.cpp config.txt
</commit_message>
<xml_diff>
--- a/weekly_update_12/2007109.docx
+++ b/weekly_update_12/2007109.docx
@@ -74,32 +74,16 @@
     </w:p>
     <w:p>
       <w:r>
-        <w:t xml:space="preserve">Problem </w:t>
-      </w:r>
-      <w:proofErr w:type="gramStart"/>
-      <w:r>
-        <w:t>statement :Dhaka</w:t>
-      </w:r>
-      <w:proofErr w:type="gramEnd"/>
-      <w:r>
-        <w:t xml:space="preserve"> is a unplanned megacity. </w:t>
-      </w:r>
-      <w:r>
-        <w:t xml:space="preserve">And here many times route is </w:t>
-      </w:r>
-      <w:proofErr w:type="gramStart"/>
-      <w:r>
-        <w:t>blocked</w:t>
-      </w:r>
-      <w:r>
-        <w:t xml:space="preserve"> </w:t>
-      </w:r>
-      <w:r>
-        <w:t>.The</w:t>
-      </w:r>
-      <w:proofErr w:type="gramEnd"/>
-      <w:r>
-        <w:t xml:space="preserve"> causes of blockage are many.</w:t>
+        <w:t xml:space="preserve">Problem statement :Dhaka is a unplanned megacity. </w:t>
+      </w:r>
+      <w:r>
+        <w:t>And here many times route is blocked</w:t>
+      </w:r>
+      <w:r>
+        <w:t xml:space="preserve"> </w:t>
+      </w:r>
+      <w:r>
+        <w:t>.The causes of blockage are many.</w:t>
       </w:r>
       <w:r>
         <w:t xml:space="preserve"> </w:t>
@@ -123,164 +107,135 @@
         <w:t xml:space="preserve"> line </w:t>
       </w:r>
       <w:r>
+        <w:t xml:space="preserve">  reconstruction </w:t>
+      </w:r>
+      <w:r>
+        <w:t>,</w:t>
+      </w:r>
+      <w:r>
+        <w:t xml:space="preserve"> </w:t>
+      </w:r>
+      <w:proofErr w:type="spellStart"/>
+      <w:r>
+        <w:t>titas</w:t>
+      </w:r>
+      <w:proofErr w:type="spellEnd"/>
+      <w:r>
         <w:t xml:space="preserve">  </w:t>
       </w:r>
-      <w:proofErr w:type="gramStart"/>
-      <w:r>
-        <w:t xml:space="preserve">reconstruction </w:t>
+      <w:r>
+        <w:t xml:space="preserve">line </w:t>
+      </w:r>
+      <w:r>
+        <w:t xml:space="preserve"> </w:t>
+      </w:r>
+      <w:r>
+        <w:t>reconstruction</w:t>
+      </w:r>
+      <w:r>
+        <w:t xml:space="preserve"> . </w:t>
+      </w:r>
+      <w:r>
+        <w:t>And all these things  generates  so much traffic on the road</w:t>
+      </w:r>
+      <w:r>
+        <w:t xml:space="preserve"> </w:t>
+      </w:r>
+      <w:r>
+        <w:t>.For this thing   road users have to wait a long amount of time. And there is a waste of working hours and cost of fuel also.</w:t>
+      </w:r>
+      <w:r>
+        <w:t xml:space="preserve"> </w:t>
+      </w:r>
+      <w:r>
+        <w:t>Also a problem is  all the vehicles cannot use all the roads. So we have to categorize all the vehicles   based on road types.</w:t>
+      </w:r>
+    </w:p>
+    <w:p>
+      <w:r>
+        <w:t>Global</w:t>
+      </w:r>
+      <w:r>
+        <w:t xml:space="preserve"> objective:</w:t>
+      </w:r>
+    </w:p>
+    <w:p>
+      <w:r>
+        <w:t xml:space="preserve">When a route is suddenly blocked by protest or if a link is broken suddenly (if one of the above thing </w:t>
+      </w:r>
+      <w:proofErr w:type="gramStart"/>
+      <w:r>
+        <w:t>occurred )</w:t>
+      </w:r>
+      <w:proofErr w:type="gramEnd"/>
+      <w:r>
+        <w:t xml:space="preserve"> then reroute vehicle and </w:t>
+      </w:r>
+      <w:r>
+        <w:t xml:space="preserve"> </w:t>
+      </w:r>
+      <w:r>
+        <w:t>stabilize</w:t>
+      </w:r>
+      <w:r>
+        <w:t xml:space="preserve">  the  network in short amount of  time . </w:t>
+      </w:r>
+    </w:p>
+    <w:p>
+      <w:r>
+        <w:t>Specific objectives:</w:t>
+      </w:r>
+    </w:p>
+    <w:p>
+      <w:r>
+        <w:t>1.</w:t>
+      </w:r>
+      <w:r>
+        <w:t>U</w:t>
+      </w:r>
+      <w:r>
+        <w:t>se category wise vehicles based on roads:</w:t>
+      </w:r>
+    </w:p>
+    <w:p>
+      <w:r>
+        <w:t xml:space="preserve">As </w:t>
+      </w:r>
+      <w:proofErr w:type="gramStart"/>
+      <w:r>
+        <w:t>roads  have</w:t>
+      </w:r>
+      <w:proofErr w:type="gramEnd"/>
+      <w:r>
+        <w:t xml:space="preserve"> their vehicle permit based on their width </w:t>
       </w:r>
       <w:r>
         <w:t>,</w:t>
       </w:r>
-      <w:proofErr w:type="gramEnd"/>
-      <w:r>
-        <w:t xml:space="preserve"> </w:t>
-      </w:r>
-      <w:proofErr w:type="spellStart"/>
-      <w:r>
-        <w:t>titas</w:t>
-      </w:r>
-      <w:proofErr w:type="spellEnd"/>
-      <w:r>
-        <w:t xml:space="preserve">  </w:t>
-      </w:r>
-      <w:r>
-        <w:t xml:space="preserve">line </w:t>
-      </w:r>
-      <w:r>
-        <w:t xml:space="preserve"> </w:t>
-      </w:r>
-      <w:r>
-        <w:t>reconstruction</w:t>
-      </w:r>
-      <w:r>
-        <w:t xml:space="preserve"> . </w:t>
-      </w:r>
-      <w:r>
-        <w:t xml:space="preserve">And all these </w:t>
-      </w:r>
-      <w:proofErr w:type="gramStart"/>
-      <w:r>
-        <w:t>things  generates</w:t>
-      </w:r>
-      <w:proofErr w:type="gramEnd"/>
-      <w:r>
-        <w:t xml:space="preserve">  so much traffic on the road</w:t>
-      </w:r>
-      <w:r>
-        <w:t xml:space="preserve"> </w:t>
-      </w:r>
-      <w:r>
-        <w:t>.For this thing   road users have to wait a long amount of time. And there is a waste of working hours and cost of fuel also.</w:t>
-      </w:r>
-      <w:r>
-        <w:t xml:space="preserve"> </w:t>
-      </w:r>
-      <w:r>
-        <w:t xml:space="preserve">Also a problem </w:t>
-      </w:r>
-      <w:proofErr w:type="gramStart"/>
-      <w:r>
-        <w:t>is  all</w:t>
-      </w:r>
-      <w:proofErr w:type="gramEnd"/>
-      <w:r>
-        <w:t xml:space="preserve"> the vehicles cannot use all the roads. </w:t>
-      </w:r>
-      <w:proofErr w:type="gramStart"/>
-      <w:r>
-        <w:t>So</w:t>
-      </w:r>
-      <w:proofErr w:type="gramEnd"/>
-      <w:r>
-        <w:t xml:space="preserve"> we have to categorize all the vehicles   based on road types.</w:t>
-      </w:r>
-    </w:p>
-    <w:p>
-      <w:r>
-        <w:t>Global</w:t>
-      </w:r>
-      <w:r>
-        <w:t xml:space="preserve"> objective:</w:t>
-      </w:r>
-    </w:p>
-    <w:p>
-      <w:r>
-        <w:t xml:space="preserve">When a route is suddenly blocked by protest or if a link is broken suddenly (if one of the above thing </w:t>
-      </w:r>
-      <w:proofErr w:type="gramStart"/>
-      <w:r>
-        <w:t>occurred )</w:t>
-      </w:r>
-      <w:proofErr w:type="gramEnd"/>
-      <w:r>
-        <w:t xml:space="preserve"> then reroute vehicle and </w:t>
-      </w:r>
-      <w:r>
-        <w:t xml:space="preserve"> </w:t>
-      </w:r>
-      <w:r>
-        <w:t>stabilize</w:t>
-      </w:r>
-      <w:r>
-        <w:t xml:space="preserve">  the  network in short amount of  time . </w:t>
-      </w:r>
-    </w:p>
-    <w:p>
-      <w:r>
-        <w:t>Specific objectives:</w:t>
-      </w:r>
-    </w:p>
-    <w:p>
-      <w:r>
-        <w:t>1.</w:t>
+      <w:r>
+        <w:t xml:space="preserve"> </w:t>
+      </w:r>
+      <w:r>
+        <w:t>construction</w:t>
+      </w:r>
+      <w:r>
+        <w:t xml:space="preserve"> </w:t>
+      </w:r>
+      <w:r>
+        <w:t xml:space="preserve">.And also all vehicles are not allowed to go on all types of the road  .So we have to use category wise path selection for different types of the   roads .This framework identify dynamically all the source destination pairs </w:t>
+      </w:r>
+      <w:r>
+        <w:t xml:space="preserve"> and generate alternative paths for all the vehicles based on source destination and access constraint of vehicles and road hierarchy.</w:t>
+      </w:r>
+    </w:p>
+    <w:p>
+      <w:r>
+        <w:t>2.</w:t>
       </w:r>
       <w:r>
         <w:t>U</w:t>
       </w:r>
       <w:r>
-        <w:t>se category wise vehicles based on roads:</w:t>
-      </w:r>
-    </w:p>
-    <w:p>
-      <w:r>
-        <w:t xml:space="preserve">As </w:t>
-      </w:r>
-      <w:proofErr w:type="gramStart"/>
-      <w:r>
-        <w:t>roads  have</w:t>
-      </w:r>
-      <w:proofErr w:type="gramEnd"/>
-      <w:r>
-        <w:t xml:space="preserve"> their vehicle permit based on their width </w:t>
-      </w:r>
-      <w:r>
-        <w:t>,</w:t>
-      </w:r>
-      <w:r>
-        <w:t xml:space="preserve"> </w:t>
-      </w:r>
-      <w:r>
-        <w:t>construction</w:t>
-      </w:r>
-      <w:r>
-        <w:t xml:space="preserve"> </w:t>
-      </w:r>
-      <w:r>
-        <w:t xml:space="preserve">.And also all vehicles are not allowed to go on all types of the road  .So we have to use category wise path selection for different types of the   roads .This framework identify dynamically all the source destination pairs </w:t>
-      </w:r>
-      <w:r>
-        <w:t xml:space="preserve"> and generate alternative paths for all the vehicles based on source destination and access constraint of vehicles and road hierarchy.</w:t>
-      </w:r>
-    </w:p>
-    <w:p>
-      <w:r>
-        <w:t>2.</w:t>
-      </w:r>
-      <w:r>
-        <w:t>U</w:t>
-      </w:r>
-      <w:r>
         <w:t xml:space="preserve">se </w:t>
       </w:r>
       <w:proofErr w:type="gramStart"/>
@@ -458,13 +413,6 @@
       <w:r>
         <w:t xml:space="preserve"> </w:t>
       </w:r>
-    </w:p>
-    <w:p>
-      <w:pPr>
-        <w:tabs>
-          <w:tab w:val="left" w:pos="1631"/>
-        </w:tabs>
-      </w:pPr>
     </w:p>
     <w:p>
       <w:pPr>
@@ -1474,10 +1422,7 @@
         <w:t xml:space="preserve"> it computes from precomputed pool  based on vehicle category and removes infeasible path and selects  best remaining path that is feasible .As  it ranked pool from best to worst ( before ).So it case  it is expected that it  takes small time then </w:t>
       </w:r>
       <w:r>
-        <w:t>s</w:t>
-      </w:r>
-      <w:r>
-        <w:t xml:space="preserve">cenario </w:t>
+        <w:t xml:space="preserve">scenario </w:t>
       </w:r>
       <w:r>
         <w:t xml:space="preserve">1 and </w:t>
@@ -1490,10 +1435,7 @@
         </w:tabs>
       </w:pPr>
       <w:r>
-        <w:t>s</w:t>
-      </w:r>
-      <w:r>
-        <w:t xml:space="preserve">cenario </w:t>
+        <w:t xml:space="preserve">scenario </w:t>
       </w:r>
       <w:r>
         <w:t>2.</w:t>
@@ -1774,9 +1716,6 @@
       </w:r>
     </w:p>
     <w:p>
-      <w:pPr>
-        <w:ind w:left="288"/>
-      </w:pPr>
       <w:r>
         <w:t>[1] M. A. H. Akhand, M. A. Habib, M. A. S. Kamal, and N. Siddique, “</w:t>
       </w:r>
@@ -1798,9 +1737,6 @@
       </w:r>
     </w:p>
     <w:p>
-      <w:pPr>
-        <w:ind w:left="288"/>
-      </w:pPr>
       <w:r>
         <w:t xml:space="preserve">[2] A. S. B. Shahadat, M. A. H. Akhand, and M. A. S. Kamal, “Visibility Adaptation in Ant Colony Optimization for Solving Traveling Salesman Problem,” Mathematics, vol. 10, no. 14, Art. no. 2448, 2022, </w:t>
       </w:r>
@@ -1814,9 +1750,6 @@
       </w:r>
     </w:p>
     <w:p>
-      <w:pPr>
-        <w:ind w:left="288"/>
-      </w:pPr>
       <w:r>
         <w:t xml:space="preserve">[3] C. Wu, S. Zhou, and L. Xiao, “Dynamic Path Planning Based on Improved Ant Colony Algorithm in Traffic Congestion,” IEEE Access, vol. 8, pp. 180773–180783, 2020, </w:t>
       </w:r>

</xml_diff>